<commit_message>
[FIX] Validacion RED v1.2
</commit_message>
<xml_diff>
--- a/fuentes/CF6_621200_AD.docx
+++ b/fuentes/CF6_621200_AD.docx
@@ -50,6 +50,7 @@
         </w:trPr>
         <w:tc>
           <w:tcPr>
+            <w:cnfStyle w:val="001000000000" w:firstRow="0" w:lastRow="0" w:firstColumn="1" w:lastColumn="0" w:oddVBand="0" w:evenVBand="0" w:oddHBand="0" w:evenHBand="0" w:firstRowFirstColumn="0" w:firstRowLastColumn="0" w:lastRowFirstColumn="0" w:lastRowLastColumn="0"/>
             <w:tcW w:w="10154" w:type="dxa"/>
             <w:gridSpan w:val="4"/>
             <w:tcMar/>
@@ -712,23 +713,33 @@
           </w:tcPr>
           <w:p>
             <w:pPr>
+              <w:pStyle w:val="Normal"/>
               <w:spacing w:line="276" w:lineRule="auto"/>
               <w:cnfStyle w:val="000000000000" w:firstRow="0" w:lastRow="0" w:firstColumn="0" w:lastColumn="0" w:oddVBand="0" w:evenVBand="0" w:oddHBand="0" w:evenHBand="0" w:firstRowFirstColumn="0" w:firstRowLastColumn="0" w:lastRowFirstColumn="0" w:lastRowLastColumn="0"/>
               <w:rPr>
                 <w:rFonts w:ascii="Arial" w:hAnsi="Arial" w:eastAsia="Arial" w:cs="Arial"/>
-                <w:color w:val="auto"/>
-                <w:sz w:val="22"/>
-                <w:szCs w:val="22"/>
-              </w:rPr>
-            </w:pPr>
-            <w:r>
-              <w:rPr>
-                <w:rFonts w:ascii="Arial" w:hAnsi="Arial" w:eastAsia="Arial" w:cs="Arial"/>
-                <w:color w:val="auto"/>
-                <w:sz w:val="22"/>
-                <w:szCs w:val="22"/>
-              </w:rPr>
-              <w:t>Evaluar la aplicación de estrategias de servicio al cliente orientadas a fortalecer la fidelización y mejorar la experiencia del consumidor.</w:t>
+                <w:noProof w:val="0"/>
+                <w:sz w:val="22"/>
+                <w:szCs w:val="22"/>
+                <w:lang w:val="es-419"/>
+              </w:rPr>
+            </w:pPr>
+            <w:r>
+              <w:rPr>
+                <w:rFonts w:ascii="Arial" w:hAnsi="Arial" w:eastAsia="Arial" w:cs="Arial"/>
+                <w:b w:val="0"/>
+                <w:bCs w:val="0"/>
+                <w:i w:val="0"/>
+                <w:iCs w:val="0"/>
+                <w:caps w:val="0"/>
+                <w:smallCaps w:val="0"/>
+                <w:noProof w:val="0"/>
+                <w:color w:val="12263F"/>
+                <w:sz w:val="22"/>
+                <w:szCs w:val="22"/>
+                <w:lang w:val="es-419"/>
+              </w:rPr>
+              <w:t>Validar el conocimiento adquirido sobre la atención al cliente.</w:t>
             </w:r>
           </w:p>
         </w:tc>

</xml_diff>

<commit_message>
AD + CFA + material ZIP
</commit_message>
<xml_diff>
--- a/fuentes/CF6_621200_AD.docx
+++ b/fuentes/CF6_621200_AD.docx
@@ -10899,6 +10899,8 @@
             <w:pPr>
               <w:pStyle w:val="Normal"/>
               <w:spacing w:line="276" w:lineRule="auto"/>
+            </w:pPr>
+            <w:r>
               <w:rPr>
                 <w:rFonts w:ascii="Arial" w:hAnsi="Arial" w:eastAsia="Arial" w:cs="Arial"/>
                 <w:b w:val="0"/>
@@ -10916,7 +10918,8 @@
                 <w:u w:val="none"/>
                 <w:lang w:val="es-CO"/>
               </w:rPr>
-            </w:pPr>
+              <w:t>Un tipo de negociación.</w:t>
+            </w:r>
           </w:p>
         </w:tc>
         <w:tc>

</xml_diff>